<commit_message>
revising theory, tests research
</commit_message>
<xml_diff>
--- a/feb_revised_theory_outline.docx
+++ b/feb_revised_theory_outline.docx
@@ -6566,7 +6566,7 @@
           <w:noProof/>
           <w:kern w:val="0"/>
         </w:rPr>
-        <w:pict w14:anchorId="4147C1AC">
+        <w:pict w14:anchorId="1F8AE453">
           <v:rect id="_x0000_i1029" alt="" style="width:468pt;height:.05pt;mso-width-percent:0;mso-height-percent:0;mso-width-percent:0;mso-height-percent:0" o:hralign="center" o:hrstd="t" o:hr="t" fillcolor="#a0a0a0" stroked="f"/>
         </w:pict>
       </w:r>
@@ -6785,7 +6785,7 @@
           <w:noProof/>
           <w:kern w:val="0"/>
         </w:rPr>
-        <w:pict w14:anchorId="31563837">
+        <w:pict w14:anchorId="0087F7DD">
           <v:rect id="_x0000_i1028" alt="" style="width:468pt;height:.05pt;mso-width-percent:0;mso-height-percent:0;mso-width-percent:0;mso-height-percent:0" o:hralign="center" o:hrstd="t" o:hr="t" fillcolor="#a0a0a0" stroked="f"/>
         </w:pict>
       </w:r>
@@ -6959,7 +6959,7 @@
           <w:noProof/>
           <w:kern w:val="0"/>
         </w:rPr>
-        <w:pict w14:anchorId="50BB8E21">
+        <w:pict w14:anchorId="6F75A6E1">
           <v:rect id="_x0000_i1027" alt="" style="width:468pt;height:.05pt;mso-width-percent:0;mso-height-percent:0;mso-width-percent:0;mso-height-percent:0" o:hralign="center" o:hrstd="t" o:hr="t" fillcolor="#a0a0a0" stroked="f"/>
         </w:pict>
       </w:r>
@@ -7133,7 +7133,7 @@
           <w:noProof/>
           <w:kern w:val="0"/>
         </w:rPr>
-        <w:pict w14:anchorId="3249C155">
+        <w:pict w14:anchorId="526EC1F9">
           <v:rect id="_x0000_i1026" alt="" style="width:468pt;height:.05pt;mso-width-percent:0;mso-height-percent:0;mso-width-percent:0;mso-height-percent:0" o:hralign="center" o:hrstd="t" o:hr="t" fillcolor="#a0a0a0" stroked="f"/>
         </w:pict>
       </w:r>
@@ -7624,7 +7624,7 @@
           <w:noProof/>
           <w:kern w:val="0"/>
         </w:rPr>
-        <w:pict w14:anchorId="5340C786">
+        <w:pict w14:anchorId="1F738784">
           <v:rect id="_x0000_i1025" alt="" style="width:468pt;height:.05pt;mso-width-percent:0;mso-height-percent:0;mso-width-percent:0;mso-height-percent:0" o:hralign="center" o:hrstd="t" o:hr="t" fillcolor="#a0a0a0" stroked="f"/>
         </w:pict>
       </w:r>

</xml_diff>